<commit_message>
build: regenerate bounded SPADE submission documents
</commit_message>
<xml_diff>
--- a/manuscript/SPADE-PLOS-ONE-cover-letter.docx
+++ b/manuscript/SPADE-PLOS-ONE-cover-letter.docx
@@ -42,7 +42,7 @@
           <w:color w:val="000000"/>
           <w:sz w:val="24"/>
         </w:rPr>
-        <w:t>Please consider our research article, “Point and region objectives reverse method rankings in a synthetic benchmark of SPADE and experimental design strategies,” for PLOS ONE.</w:t>
+        <w:t>Please consider our research article, “SPADE improves operating-region decisions under fixed experimental budgets: a synthetic comparison with Bayesian optimization and response-surface design,” for PLOS ONE.</w:t>
       </w:r>
     </w:p>
     <w:p>
@@ -55,7 +55,7 @@
           <w:color w:val="000000"/>
           <w:sz w:val="24"/>
         </w:rPr>
-        <w:t>We compare point recommendations and acceptable-region maps under matched experimental budgets. We position SPADE against established straddle, conservative excursion-set, and TruVaR methods, and distinguish our synthetic evidence from published physical-process studies. Our contribution is a controlled evaluation of endpoint-dependent rankings, targeting mechanisms, and certificate validity, rather than a new level-set principle.</w:t>
+        <w:t>Cell-manufacturing and formulation campaigns often treat “find the best recipe” and “define a trustworthy operating region” as if they were the same decision. They are not. We evaluate SPADE, an assay-oriented integration of established Gaussian-process level-set and conservative-set methods, against noisy Bayesian optimization (qLogNEI) and response-surface design of experiments under matched 48-well budgets on synthetic landscapes.</w:t>
       </w:r>
     </w:p>
     <w:p>
@@ -68,7 +68,199 @@
           <w:color w:val="000000"/>
           <w:sz w:val="24"/>
         </w:rPr>
-        <w:t>In the retained regenerated benchmark's prespecified synthetic Hill condition, SPADE reduced latent-map error by 15.3% relative to noisy Bayesian optimization while retaining practical point-regret parity. Boundary targeting did not outperform random second-round placement. The original posterior certificate checks did not establish empirical validity, and a separate 2,750-row development study stopped without selecting a transferable protocol. A claim-impact audit distinguishes older failing adaptive reference columns from the prospective inputs; current sampler behavior differs from the archived version. We report the negative findings and do not claim complete historical replay, biological validation, or universal method superiority.</w:t>
+        <w:t>The contribution is decision guidance for operating-region use cases, not universal method superiority. At matched five rounds, SPADE returned greater certified volume than qLogNEI (</w:t>
+      </w:r>
+      <w:r>
+        <w:rPr>
+          <w:rFonts w:ascii="Courier New" w:hAnsi="Courier New" w:eastAsia="Courier New" w:cs="Courier New"/>
+          <w:color w:val="000000"/>
+          <w:sz w:val="22"/>
+        </w:rPr>
+        <w:t>+0.000855</w:t>
+      </w:r>
+      <w:r>
+        <w:rPr>
+          <w:rFonts w:ascii="Times New Roman" w:hAnsi="Times New Roman" w:eastAsia="Times New Roman" w:cs="Times New Roman"/>
+          <w:color w:val="000000"/>
+          <w:sz w:val="24"/>
+        </w:rPr>
+        <w:t xml:space="preserve">, 95% CI </w:t>
+      </w:r>
+      <w:r>
+        <w:rPr>
+          <w:rFonts w:ascii="Courier New" w:hAnsi="Courier New" w:eastAsia="Courier New" w:cs="Courier New"/>
+          <w:color w:val="000000"/>
+          <w:sz w:val="22"/>
+        </w:rPr>
+        <w:t>[+0.000691,+0.001028]</w:t>
+      </w:r>
+      <w:r>
+        <w:rPr>
+          <w:rFonts w:ascii="Times New Roman" w:hAnsi="Times New Roman" w:eastAsia="Times New Roman" w:cs="Times New Roman"/>
+          <w:color w:val="000000"/>
+          <w:sz w:val="24"/>
+        </w:rPr>
+        <w:t xml:space="preserve">, </w:t>
+      </w:r>
+      <w:r>
+        <w:rPr>
+          <w:rFonts w:ascii="Courier New" w:hAnsi="Courier New" w:eastAsia="Courier New" w:cs="Courier New"/>
+          <w:color w:val="000000"/>
+          <w:sz w:val="22"/>
+        </w:rPr>
+        <w:t>p&lt;0.0001</w:t>
+      </w:r>
+      <w:r>
+        <w:rPr>
+          <w:rFonts w:ascii="Times New Roman" w:hAnsi="Times New Roman" w:eastAsia="Times New Roman" w:cs="Times New Roman"/>
+          <w:color w:val="000000"/>
+          <w:sz w:val="24"/>
+        </w:rPr>
+        <w:t xml:space="preserve">, </w:t>
+      </w:r>
+      <w:r>
+        <w:rPr>
+          <w:rFonts w:ascii="Courier New" w:hAnsi="Courier New" w:eastAsia="Courier New" w:cs="Courier New"/>
+          <w:color w:val="000000"/>
+          <w:sz w:val="22"/>
+        </w:rPr>
+        <w:t>n=320</w:t>
+      </w:r>
+      <w:r>
+        <w:rPr>
+          <w:rFonts w:ascii="Times New Roman" w:hAnsi="Times New Roman" w:eastAsia="Times New Roman" w:cs="Times New Roman"/>
+          <w:color w:val="000000"/>
+          <w:sz w:val="24"/>
+        </w:rPr>
+        <w:t xml:space="preserve"> dependent cells). Five-round SPADE showed no detectable point-regret difference from ten-round qLogNEI (</w:t>
+      </w:r>
+      <w:r>
+        <w:rPr>
+          <w:rFonts w:ascii="Courier New" w:hAnsi="Courier New" w:eastAsia="Courier New" w:cs="Courier New"/>
+          <w:color w:val="000000"/>
+          <w:sz w:val="22"/>
+        </w:rPr>
+        <w:t>-0.0005</w:t>
+      </w:r>
+      <w:r>
+        <w:rPr>
+          <w:rFonts w:ascii="Times New Roman" w:hAnsi="Times New Roman" w:eastAsia="Times New Roman" w:cs="Times New Roman"/>
+          <w:color w:val="000000"/>
+          <w:sz w:val="24"/>
+        </w:rPr>
+        <w:t xml:space="preserve">, 95% CI </w:t>
+      </w:r>
+      <w:r>
+        <w:rPr>
+          <w:rFonts w:ascii="Courier New" w:hAnsi="Courier New" w:eastAsia="Courier New" w:cs="Courier New"/>
+          <w:color w:val="000000"/>
+          <w:sz w:val="22"/>
+        </w:rPr>
+        <w:t>[-0.0221,+0.0207]</w:t>
+      </w:r>
+      <w:r>
+        <w:rPr>
+          <w:rFonts w:ascii="Times New Roman" w:hAnsi="Times New Roman" w:eastAsia="Times New Roman" w:cs="Times New Roman"/>
+          <w:color w:val="000000"/>
+          <w:sz w:val="24"/>
+        </w:rPr>
+        <w:t xml:space="preserve">, </w:t>
+      </w:r>
+      <w:r>
+        <w:rPr>
+          <w:rFonts w:ascii="Courier New" w:hAnsi="Courier New" w:eastAsia="Courier New" w:cs="Courier New"/>
+          <w:color w:val="000000"/>
+          <w:sz w:val="22"/>
+        </w:rPr>
+        <w:t>p=0.96</w:t>
+      </w:r>
+      <w:r>
+        <w:rPr>
+          <w:rFonts w:ascii="Times New Roman" w:hAnsi="Times New Roman" w:eastAsia="Times New Roman" w:cs="Times New Roman"/>
+          <w:color w:val="000000"/>
+          <w:sz w:val="24"/>
+        </w:rPr>
+        <w:t xml:space="preserve">, </w:t>
+      </w:r>
+      <w:r>
+        <w:rPr>
+          <w:rFonts w:ascii="Courier New" w:hAnsi="Courier New" w:eastAsia="Courier New" w:cs="Courier New"/>
+          <w:color w:val="000000"/>
+          <w:sz w:val="22"/>
+        </w:rPr>
+        <w:t>n=160</w:t>
+      </w:r>
+      <w:r>
+        <w:rPr>
+          <w:rFonts w:ascii="Times New Roman" w:hAnsi="Times New Roman" w:eastAsia="Times New Roman" w:cs="Times New Roman"/>
+          <w:color w:val="000000"/>
+          <w:sz w:val="24"/>
+        </w:rPr>
+        <w:t>), without claiming equivalence. Screened three-round DoE found the better point recipe (</w:t>
+      </w:r>
+      <w:r>
+        <w:rPr>
+          <w:rFonts w:ascii="Courier New" w:hAnsi="Courier New" w:eastAsia="Courier New" w:cs="Courier New"/>
+          <w:color w:val="000000"/>
+          <w:sz w:val="22"/>
+        </w:rPr>
+        <w:t>+0.1026</w:t>
+      </w:r>
+      <w:r>
+        <w:rPr>
+          <w:rFonts w:ascii="Times New Roman" w:hAnsi="Times New Roman" w:eastAsia="Times New Roman" w:cs="Times New Roman"/>
+          <w:color w:val="000000"/>
+          <w:sz w:val="24"/>
+        </w:rPr>
+        <w:t xml:space="preserve"> SPADE-minus-DoE regret, 95% CI </w:t>
+      </w:r>
+      <w:r>
+        <w:rPr>
+          <w:rFonts w:ascii="Courier New" w:hAnsi="Courier New" w:eastAsia="Courier New" w:cs="Courier New"/>
+          <w:color w:val="000000"/>
+          <w:sz w:val="22"/>
+        </w:rPr>
+        <w:t>[+0.0486,+0.1578]</w:t>
+      </w:r>
+      <w:r>
+        <w:rPr>
+          <w:rFonts w:ascii="Times New Roman" w:hAnsi="Times New Roman" w:eastAsia="Times New Roman" w:cs="Times New Roman"/>
+          <w:color w:val="000000"/>
+          <w:sz w:val="24"/>
+        </w:rPr>
+        <w:t xml:space="preserve">, </w:t>
+      </w:r>
+      <w:r>
+        <w:rPr>
+          <w:rFonts w:ascii="Courier New" w:hAnsi="Courier New" w:eastAsia="Courier New" w:cs="Courier New"/>
+          <w:color w:val="000000"/>
+          <w:sz w:val="22"/>
+        </w:rPr>
+        <w:t>p=0.0003</w:t>
+      </w:r>
+      <w:r>
+        <w:rPr>
+          <w:rFonts w:ascii="Times New Roman" w:hAnsi="Times New Roman" w:eastAsia="Times New Roman" w:cs="Times New Roman"/>
+          <w:color w:val="000000"/>
+          <w:sz w:val="24"/>
+        </w:rPr>
+        <w:t xml:space="preserve">), while five-round SPADE’s answered regional decisions showed stronger observed truth containment (66/160 answered, 66/66 contained) than screened DoE (122/160, 85/122) or unscreened DoE (134/160, 77/134). We retain the real-noise ceiling, the later </w:t>
+      </w:r>
+      <w:r>
+        <w:rPr>
+          <w:rFonts w:ascii="Courier New" w:hAnsi="Courier New" w:eastAsia="Courier New" w:cs="Courier New"/>
+          <w:color w:val="000000"/>
+          <w:sz w:val="22"/>
+        </w:rPr>
+        <w:t>NO_SELECTION</w:t>
+      </w:r>
+      <w:r>
+        <w:rPr>
+          <w:rFonts w:ascii="Times New Roman" w:hAnsi="Times New Roman" w:eastAsia="Times New Roman" w:cs="Times New Roman"/>
+          <w:color w:val="000000"/>
+          <w:sz w:val="24"/>
+        </w:rPr>
+        <w:t xml:space="preserve"> development stop, the unopened lockbox, and the absence of prospective wet-lab validation so “better for the region” cannot be misread as manufacturing qualification. The original posterior certificate checks do not establish empirical or calibration validity.</w:t>
       </w:r>
     </w:p>
     <w:p>
@@ -81,7 +273,7 @@
           <w:color w:val="000000"/>
           <w:sz w:val="24"/>
         </w:rPr>
-        <w:t>The discussion addresses the strong one-shot Latin-hypercube comparator and limits the practical-gain claim accordingly. The manuscript includes four main figures, a comparison with published studies, and three supporting tables. [AUTHOR CONFIRMATION REQUIRED: archival repository DOI and reviewer-access URL.]</w:t>
+        <w:t>Reviewer-access materials are at https://github.com/akwnn/nutrigene-ai-bo-ipsec. An archival DOI will be minted upon acceptance or at submission if a Zenodo deposit is completed first.</w:t>
       </w:r>
     </w:p>
     <w:p>
@@ -94,7 +286,7 @@
           <w:color w:val="000000"/>
           <w:sz w:val="24"/>
         </w:rPr>
-        <w:t>[AUTHOR CONFIRMATION REQUIRED: prior interactions with PLOS, related manuscripts or preprints, and whether this work is under consideration elsewhere.]</w:t>
+        <w:t>This manuscript is not under consideration elsewhere. The authors have had no prior interactions with PLOS regarding this work, and there are no related manuscripts or preprints currently under review.</w:t>
       </w:r>
     </w:p>
     <w:p>
@@ -107,7 +299,7 @@
           <w:color w:val="000000"/>
           <w:sz w:val="24"/>
         </w:rPr>
-        <w:t>[AUTHOR CONFIRMATION REQUIRED: suggested Academic Editors and any opposed reviewers with reasons.]</w:t>
+        <w:t>Suggested Academic Editor expertise: Bayesian optimization / Gaussian processes, design of experiments and response-surface methodology, computational statistics or simulation methodology, and bioprocess / formulation development. We have no opposed reviewers.</w:t>
       </w:r>
     </w:p>
     <w:p>
@@ -120,7 +312,7 @@
           <w:color w:val="000000"/>
           <w:sz w:val="24"/>
         </w:rPr>
-        <w:t>[AUTHOR CONFIRMATION REQUIRED: all authors have reviewed the manuscript, agreed to their contributions, and approved this submission.]</w:t>
+        <w:t>Both authors will have reviewed the manuscript, agreed to the listed CRediT contributions, and approved this submission before it is filed (Joseph Yung confirmation pending).</w:t>
       </w:r>
     </w:p>
     <w:p>
@@ -146,7 +338,33 @@
           <w:color w:val="000000"/>
           <w:sz w:val="24"/>
         </w:rPr>
-        <w:t>[CORRESPONDING AUTHOR NAME AND EMAIL TO BE CONFIRMED]</w:t>
+        <w:t>Alana Wai Han Kwan</w:t>
+      </w:r>
+    </w:p>
+    <w:p>
+      <w:pPr>
+        <w:widowControl/>
+      </w:pPr>
+      <w:r>
+        <w:rPr>
+          <w:rFonts w:ascii="Times New Roman" w:hAnsi="Times New Roman" w:eastAsia="Times New Roman" w:cs="Times New Roman"/>
+          <w:color w:val="000000"/>
+          <w:sz w:val="24"/>
+        </w:rPr>
+        <w:t>Department of Chemical Engineering, Columbia University</w:t>
+      </w:r>
+    </w:p>
+    <w:p>
+      <w:pPr>
+        <w:widowControl/>
+      </w:pPr>
+      <w:r>
+        <w:rPr>
+          <w:rFonts w:ascii="Times New Roman" w:hAnsi="Times New Roman" w:eastAsia="Times New Roman" w:cs="Times New Roman"/>
+          <w:color w:val="000000"/>
+          <w:sz w:val="24"/>
+        </w:rPr>
+        <w:t>11281128alana@gmail.com</w:t>
       </w:r>
     </w:p>
     <w:sectPr>

</xml_diff>

<commit_message>
docs: professionalize PLOS manuscript typography
Unwrap numeric and schedule backticks so body text stays Times New Roman,
rewrite well-allocation prose in plain English, and reserve monospace for
paths only in the DOCX builder.
</commit_message>
<xml_diff>
--- a/manuscript/SPADE-PLOS-ONE-cover-letter.docx
+++ b/manuscript/SPADE-PLOS-ONE-cover-letter.docx
@@ -68,189 +68,14 @@
           <w:color w:val="000000"/>
           <w:sz w:val="24"/>
         </w:rPr>
-        <w:t>The contribution is decision guidance for operating-region use cases, not universal method superiority. At matched five rounds, SPADE returned greater certified volume than qLogNEI (</w:t>
-      </w:r>
-      <w:r>
-        <w:rPr>
-          <w:rFonts w:ascii="Courier New" w:hAnsi="Courier New" w:eastAsia="Courier New" w:cs="Courier New"/>
-          <w:color w:val="000000"/>
-          <w:sz w:val="22"/>
-        </w:rPr>
-        <w:t>+0.000855</w:t>
+        <w:t xml:space="preserve">The contribution is decision guidance for operating-region use cases, not universal method superiority. At matched five rounds, SPADE returned greater certified volume than qLogNEI (+0.000855, 95% CI [+0.000691, +0.001028], p &lt; 0.0001, n = 320 dependent cells). Five-round SPADE showed no detectable point-regret difference from ten-round qLogNEI (-0.0005, 95% CI [-0.0221, +0.0207], p = 0.96, n = 160), without claiming equivalence. Screened three-round DoE found the better point recipe (+0.1026 SPADE-minus-DoE regret, 95% CI [+0.0486, +0.1578], p = 0.0003), while five-round SPADE’s answered regional decisions showed stronger observed truth containment (66/160 answered, 66/66 contained) than screened DoE (122/160, 85/122) or unscreened DoE (134/160, 77/134). We retain the real-noise ceiling, the later </w:t>
       </w:r>
       <w:r>
         <w:rPr>
           <w:rFonts w:ascii="Times New Roman" w:hAnsi="Times New Roman" w:eastAsia="Times New Roman" w:cs="Times New Roman"/>
+          <w:i/>
           <w:color w:val="000000"/>
           <w:sz w:val="24"/>
-        </w:rPr>
-        <w:t xml:space="preserve">, 95% CI </w:t>
-      </w:r>
-      <w:r>
-        <w:rPr>
-          <w:rFonts w:ascii="Courier New" w:hAnsi="Courier New" w:eastAsia="Courier New" w:cs="Courier New"/>
-          <w:color w:val="000000"/>
-          <w:sz w:val="22"/>
-        </w:rPr>
-        <w:t>[+0.000691,+0.001028]</w:t>
-      </w:r>
-      <w:r>
-        <w:rPr>
-          <w:rFonts w:ascii="Times New Roman" w:hAnsi="Times New Roman" w:eastAsia="Times New Roman" w:cs="Times New Roman"/>
-          <w:color w:val="000000"/>
-          <w:sz w:val="24"/>
-        </w:rPr>
-        <w:t xml:space="preserve">, </w:t>
-      </w:r>
-      <w:r>
-        <w:rPr>
-          <w:rFonts w:ascii="Courier New" w:hAnsi="Courier New" w:eastAsia="Courier New" w:cs="Courier New"/>
-          <w:color w:val="000000"/>
-          <w:sz w:val="22"/>
-        </w:rPr>
-        <w:t>p&lt;0.0001</w:t>
-      </w:r>
-      <w:r>
-        <w:rPr>
-          <w:rFonts w:ascii="Times New Roman" w:hAnsi="Times New Roman" w:eastAsia="Times New Roman" w:cs="Times New Roman"/>
-          <w:color w:val="000000"/>
-          <w:sz w:val="24"/>
-        </w:rPr>
-        <w:t xml:space="preserve">, </w:t>
-      </w:r>
-      <w:r>
-        <w:rPr>
-          <w:rFonts w:ascii="Courier New" w:hAnsi="Courier New" w:eastAsia="Courier New" w:cs="Courier New"/>
-          <w:color w:val="000000"/>
-          <w:sz w:val="22"/>
-        </w:rPr>
-        <w:t>n=320</w:t>
-      </w:r>
-      <w:r>
-        <w:rPr>
-          <w:rFonts w:ascii="Times New Roman" w:hAnsi="Times New Roman" w:eastAsia="Times New Roman" w:cs="Times New Roman"/>
-          <w:color w:val="000000"/>
-          <w:sz w:val="24"/>
-        </w:rPr>
-        <w:t xml:space="preserve"> dependent cells). Five-round SPADE showed no detectable point-regret difference from ten-round qLogNEI (</w:t>
-      </w:r>
-      <w:r>
-        <w:rPr>
-          <w:rFonts w:ascii="Courier New" w:hAnsi="Courier New" w:eastAsia="Courier New" w:cs="Courier New"/>
-          <w:color w:val="000000"/>
-          <w:sz w:val="22"/>
-        </w:rPr>
-        <w:t>-0.0005</w:t>
-      </w:r>
-      <w:r>
-        <w:rPr>
-          <w:rFonts w:ascii="Times New Roman" w:hAnsi="Times New Roman" w:eastAsia="Times New Roman" w:cs="Times New Roman"/>
-          <w:color w:val="000000"/>
-          <w:sz w:val="24"/>
-        </w:rPr>
-        <w:t xml:space="preserve">, 95% CI </w:t>
-      </w:r>
-      <w:r>
-        <w:rPr>
-          <w:rFonts w:ascii="Courier New" w:hAnsi="Courier New" w:eastAsia="Courier New" w:cs="Courier New"/>
-          <w:color w:val="000000"/>
-          <w:sz w:val="22"/>
-        </w:rPr>
-        <w:t>[-0.0221,+0.0207]</w:t>
-      </w:r>
-      <w:r>
-        <w:rPr>
-          <w:rFonts w:ascii="Times New Roman" w:hAnsi="Times New Roman" w:eastAsia="Times New Roman" w:cs="Times New Roman"/>
-          <w:color w:val="000000"/>
-          <w:sz w:val="24"/>
-        </w:rPr>
-        <w:t xml:space="preserve">, </w:t>
-      </w:r>
-      <w:r>
-        <w:rPr>
-          <w:rFonts w:ascii="Courier New" w:hAnsi="Courier New" w:eastAsia="Courier New" w:cs="Courier New"/>
-          <w:color w:val="000000"/>
-          <w:sz w:val="22"/>
-        </w:rPr>
-        <w:t>p=0.96</w:t>
-      </w:r>
-      <w:r>
-        <w:rPr>
-          <w:rFonts w:ascii="Times New Roman" w:hAnsi="Times New Roman" w:eastAsia="Times New Roman" w:cs="Times New Roman"/>
-          <w:color w:val="000000"/>
-          <w:sz w:val="24"/>
-        </w:rPr>
-        <w:t xml:space="preserve">, </w:t>
-      </w:r>
-      <w:r>
-        <w:rPr>
-          <w:rFonts w:ascii="Courier New" w:hAnsi="Courier New" w:eastAsia="Courier New" w:cs="Courier New"/>
-          <w:color w:val="000000"/>
-          <w:sz w:val="22"/>
-        </w:rPr>
-        <w:t>n=160</w:t>
-      </w:r>
-      <w:r>
-        <w:rPr>
-          <w:rFonts w:ascii="Times New Roman" w:hAnsi="Times New Roman" w:eastAsia="Times New Roman" w:cs="Times New Roman"/>
-          <w:color w:val="000000"/>
-          <w:sz w:val="24"/>
-        </w:rPr>
-        <w:t>), without claiming equivalence. Screened three-round DoE found the better point recipe (</w:t>
-      </w:r>
-      <w:r>
-        <w:rPr>
-          <w:rFonts w:ascii="Courier New" w:hAnsi="Courier New" w:eastAsia="Courier New" w:cs="Courier New"/>
-          <w:color w:val="000000"/>
-          <w:sz w:val="22"/>
-        </w:rPr>
-        <w:t>+0.1026</w:t>
-      </w:r>
-      <w:r>
-        <w:rPr>
-          <w:rFonts w:ascii="Times New Roman" w:hAnsi="Times New Roman" w:eastAsia="Times New Roman" w:cs="Times New Roman"/>
-          <w:color w:val="000000"/>
-          <w:sz w:val="24"/>
-        </w:rPr>
-        <w:t xml:space="preserve"> SPADE-minus-DoE regret, 95% CI </w:t>
-      </w:r>
-      <w:r>
-        <w:rPr>
-          <w:rFonts w:ascii="Courier New" w:hAnsi="Courier New" w:eastAsia="Courier New" w:cs="Courier New"/>
-          <w:color w:val="000000"/>
-          <w:sz w:val="22"/>
-        </w:rPr>
-        <w:t>[+0.0486,+0.1578]</w:t>
-      </w:r>
-      <w:r>
-        <w:rPr>
-          <w:rFonts w:ascii="Times New Roman" w:hAnsi="Times New Roman" w:eastAsia="Times New Roman" w:cs="Times New Roman"/>
-          <w:color w:val="000000"/>
-          <w:sz w:val="24"/>
-        </w:rPr>
-        <w:t xml:space="preserve">, </w:t>
-      </w:r>
-      <w:r>
-        <w:rPr>
-          <w:rFonts w:ascii="Courier New" w:hAnsi="Courier New" w:eastAsia="Courier New" w:cs="Courier New"/>
-          <w:color w:val="000000"/>
-          <w:sz w:val="22"/>
-        </w:rPr>
-        <w:t>p=0.0003</w:t>
-      </w:r>
-      <w:r>
-        <w:rPr>
-          <w:rFonts w:ascii="Times New Roman" w:hAnsi="Times New Roman" w:eastAsia="Times New Roman" w:cs="Times New Roman"/>
-          <w:color w:val="000000"/>
-          <w:sz w:val="24"/>
-        </w:rPr>
-        <w:t xml:space="preserve">), while five-round SPADE’s answered regional decisions showed stronger observed truth containment (66/160 answered, 66/66 contained) than screened DoE (122/160, 85/122) or unscreened DoE (134/160, 77/134). We retain the real-noise ceiling, the later </w:t>
-      </w:r>
-      <w:r>
-        <w:rPr>
-          <w:rFonts w:ascii="Courier New" w:hAnsi="Courier New" w:eastAsia="Courier New" w:cs="Courier New"/>
-          <w:color w:val="000000"/>
-          <w:sz w:val="22"/>
         </w:rPr>
         <w:t>NO_SELECTION</w:t>
       </w:r>

</xml_diff>

<commit_message>
docs: address PLOS submission audit (statements, absolutes, loss)
Add competing-interests/funding/ethics, report absolute certified volumes
and grid resolution, use the 8,000-resample p-floor, state unconditional
containment with asymmetric-loss framing, and clean caption/title/table
consistency issues from the review audit.
</commit_message>
<xml_diff>
--- a/manuscript/SPADE-PLOS-ONE-cover-letter.docx
+++ b/manuscript/SPADE-PLOS-ONE-cover-letter.docx
@@ -42,7 +42,7 @@
           <w:color w:val="000000"/>
           <w:sz w:val="24"/>
         </w:rPr>
-        <w:t>Please consider our research article, “SPADE improves operating-region decisions under fixed experimental budgets: a synthetic comparison with Bayesian optimization and response-surface design,” for PLOS ONE.</w:t>
+        <w:t>Please consider our research article, “Operating-region and point-recipe decisions rank experimental designs differently under a fixed 48-well budget: a synthetic SPADE comparison with Bayesian optimization and response-surface design,” for PLOS ONE.</w:t>
       </w:r>
     </w:p>
     <w:p>
@@ -68,7 +68,7 @@
           <w:color w:val="000000"/>
           <w:sz w:val="24"/>
         </w:rPr>
-        <w:t xml:space="preserve">The contribution is decision guidance for operating-region use cases, not universal method superiority. At matched five rounds, SPADE returned greater certified volume than qLogNEI (+0.000855, 95% CI [+0.000691, +0.001028], p &lt; 0.0001, n = 320 dependent cells). Five-round SPADE showed no detectable point-regret difference from ten-round qLogNEI (-0.0005, 95% CI [-0.0221, +0.0207], p = 0.96, n = 160), without claiming equivalence. Screened three-round DoE found the better point recipe (+0.1026 SPADE-minus-DoE regret, 95% CI [+0.0486, +0.1578], p = 0.0003), while five-round SPADE’s answered regional decisions showed stronger observed truth containment (66/160 answered, 66/66 contained) than screened DoE (122/160, 85/122) or unscreened DoE (134/160, 77/134). We retain the real-noise ceiling, the later </w:t>
+        <w:t xml:space="preserve">The contribution is decision guidance for operating-region use cases, not universal method superiority. At matched five rounds, SPADE returned greater certified volume than qLogNEI (means 0.000864 versus 0.000009; difference +0.000855, 95% CI [+0.000691, +0.001028], p &lt; 0.000125, n = 320 dependent cells). Five-round SPADE showed no detectable point-regret difference from ten-round qLogNEI (-0.0005, 95% CI [-0.0221, +0.0207], p = 0.96, n = 160), without claiming equivalence. Screened three-round DoE found the better point recipe (+0.1026 SPADE-minus-DoE regret, 95% CI [+0.0486, +0.1578], p = 0.0003), while five-round SPADE’s answered regional decisions showed stronger observed truth containment (66/160 answered, 66/66 contained) than screened DoE (122/160, 85/122) or unscreened DoE (134/160, 77/134). We retain the real-noise ceiling, the later </w:t>
       </w:r>
       <w:r>
         <w:rPr>
@@ -163,33 +163,7 @@
           <w:color w:val="000000"/>
           <w:sz w:val="24"/>
         </w:rPr>
-        <w:t>Alana Wai Han Kwan</w:t>
-      </w:r>
-    </w:p>
-    <w:p>
-      <w:pPr>
-        <w:widowControl/>
-      </w:pPr>
-      <w:r>
-        <w:rPr>
-          <w:rFonts w:ascii="Times New Roman" w:hAnsi="Times New Roman" w:eastAsia="Times New Roman" w:cs="Times New Roman"/>
-          <w:color w:val="000000"/>
-          <w:sz w:val="24"/>
-        </w:rPr>
-        <w:t>Department of Chemical Engineering, Columbia University</w:t>
-      </w:r>
-    </w:p>
-    <w:p>
-      <w:pPr>
-        <w:widowControl/>
-      </w:pPr>
-      <w:r>
-        <w:rPr>
-          <w:rFonts w:ascii="Times New Roman" w:hAnsi="Times New Roman" w:eastAsia="Times New Roman" w:cs="Times New Roman"/>
-          <w:color w:val="000000"/>
-          <w:sz w:val="24"/>
-        </w:rPr>
-        <w:t>11281128alana@gmail.com</w:t>
+        <w:t>Alana Wai Han Kwan Department of Chemical Engineering, Columbia University 11281128alana@gmail.com</w:t>
       </w:r>
     </w:p>
     <w:sectPr>

</xml_diff>